<commit_message>
Address code review feedback: improve documentation and script quality
Co-authored-by: ghifiardi <104190361+ghifiardi@users.noreply.github.com>
</commit_message>
<xml_diff>
--- a/Property_Brokerage_Documentation.docx
+++ b/Property_Brokerage_Documentation.docx
@@ -1602,7 +1602,7 @@
     </w:p>
     <w:p>
       <w:r>
-        <w:t>API Endpoint: https://api.yourdomain.com/v1/</w:t>
+        <w:t>API Endpoint: https://api.propertybrokerage.com/v1/</w:t>
       </w:r>
     </w:p>
     <w:p>
@@ -2094,22 +2094,22 @@
     </w:p>
     <w:p>
       <w:r>
-        <w:t>Email: support@propertybrokerage.com</w:t>
-      </w:r>
-    </w:p>
-    <w:p>
-      <w:r>
-        <w:t>Phone: 1-800-PROPERTY (1-800-776-7378)</w:t>
-      </w:r>
-    </w:p>
-    <w:p>
-      <w:r>
-        <w:t>Support Hours: Monday-Friday, 8:00 AM - 8:00 PM EST</w:t>
-      </w:r>
-    </w:p>
-    <w:p>
-      <w:r>
-        <w:t>Emergency Support: 24/7 for critical issues</w:t>
+        <w:t>Email: support@propertybrokerage.com (configure with your actual support email)</w:t>
+      </w:r>
+    </w:p>
+    <w:p>
+      <w:r>
+        <w:t>Phone: 1-800-PROPERTY (configure with your actual support phone)</w:t>
+      </w:r>
+    </w:p>
+    <w:p>
+      <w:r>
+        <w:t>Support Hours: Configure based on your organization's availability</w:t>
+      </w:r>
+    </w:p>
+    <w:p>
+      <w:r>
+        <w:t>Emergency Support: Configure based on your SLA requirements</w:t>
       </w:r>
     </w:p>
     <w:p>
@@ -2122,22 +2122,22 @@
     </w:p>
     <w:p>
       <w:r>
-        <w:t>Online Help Center: https://help.propertybrokerage.com</w:t>
-      </w:r>
-    </w:p>
-    <w:p>
-      <w:r>
-        <w:t>Video Tutorials: https://tutorials.propertybrokerage.com</w:t>
-      </w:r>
-    </w:p>
-    <w:p>
-      <w:r>
-        <w:t>User Community Forum: https://community.propertybrokerage.com</w:t>
-      </w:r>
-    </w:p>
-    <w:p>
-      <w:r>
-        <w:t>API Documentation: https://api.propertybrokerage.com/docs</w:t>
+        <w:t>Online Help Center: Configure with your help center URL</w:t>
+      </w:r>
+    </w:p>
+    <w:p>
+      <w:r>
+        <w:t>Video Tutorials: Configure with your tutorials URL</w:t>
+      </w:r>
+    </w:p>
+    <w:p>
+      <w:r>
+        <w:t>User Community Forum: Configure with your community forum URL</w:t>
+      </w:r>
+    </w:p>
+    <w:p>
+      <w:r>
+        <w:t>API Documentation: Configure with your API documentation URL</w:t>
       </w:r>
     </w:p>
     <w:p>
@@ -2183,12 +2183,12 @@
     </w:p>
     <w:p>
       <w:r>
-        <w:t>Email: feedback@propertybrokerage.com</w:t>
-      </w:r>
-    </w:p>
-    <w:p>
-      <w:r>
-        <w:t>Feature Request Portal: https://feedback.propertybrokerage.com</w:t>
+        <w:t>Email: feedback@propertybrokerage.com (configure with your feedback email)</w:t>
+      </w:r>
+    </w:p>
+    <w:p>
+      <w:r>
+        <w:t>Feature Request Portal: Configure with your feature request portal URL</w:t>
       </w:r>
     </w:p>
     <w:p>

</xml_diff>